<commit_message>
Fix references: add Mohr & Schumacher (2019), correct Montero-Teran initial
- Add missing Mohr, A. and Schumacher, C. (2019) reference cited in-text
- Correct Sinkovics et al. author from Montero-Teran, H.N. to H.

Co-Authored-By: Claude Opus 4.8 <noreply@anthropic.com>
Claude-Session: https://claude.ai/code/session_01467iCMchpirXZm1er2TZxF
</commit_message>
<xml_diff>
--- a/Selling_the_Nation.docx
+++ b/Selling_the_Nation.docx
@@ -1006,6 +1006,26 @@
           <w:szCs w:val="22"/>
           <w:lang w:val="en-US"/>
         </w:rPr>
+        <w:t xml:space="preserve">Mohr, A. and Schumacher, C. (2019), “The contingent effect of patriotic rhetoric on firm performance”, Strategy Science, Vol. 4 No. 2, pp. 94–110.</w:t>
+      </w:r>
+    </w:p>
+    <w:p>
+      <w:pPr>
+        <w:spacing w:after="0" w:line="480" w:lineRule="auto"/>
+        <w:rPr>
+          <w:rFonts w:ascii="Times New Roman" w:hAnsi="Times New Roman" w:cs="Times New Roman"/>
+          <w:sz w:val="22"/>
+          <w:szCs w:val="22"/>
+          <w:lang w:val="en-US"/>
+        </w:rPr>
+      </w:pPr>
+      <w:r>
+        <w:rPr>
+          <w:rFonts w:ascii="Times New Roman" w:hAnsi="Times New Roman" w:cs="Times New Roman"/>
+          <w:sz w:val="22"/>
+          <w:szCs w:val="22"/>
+          <w:lang w:val="en-US"/>
+        </w:rPr>
         <w:t>Shimp, T.A. and Sharma, S. (1987), “Consumer ethnocentrism: Construction and validation of the CETSCALE”, Journal of Marketing Research, Vol. 24 No. 3, pp. 280–289.</w:t>
       </w:r>
     </w:p>
@@ -1026,7 +1046,7 @@
           <w:szCs w:val="22"/>
           <w:lang w:val="en-US"/>
         </w:rPr>
-        <w:t xml:space="preserve">Sinkovics, R.R., Curran, L., Montero-Teran, H.N. and </w:t>
+        <w:t xml:space="preserve">Sinkovics, R.R., Curran, L., Montero-Teran, H. and </w:t>
       </w:r>
       <w:proofErr w:type="spellStart"/>
       <w:r>

</xml_diff>

<commit_message>
Fill in DOIs for Burmester and Sinkovics (2026) CPoIB references
Replace 'THIS ISSUE' placeholders with EarlyCite details from the source PDFs:
- Burmester et al. (2026): doi 10.1108/cpoib-03-2026-0059
- Sinkovics et al. (2026): doi 10.1108/cpoib-03-2026-0056

Co-Authored-By: Claude Opus 4.8 <noreply@anthropic.com>
Claude-Session: https://claude.ai/code/session_01467iCMchpirXZm1er2TZxF
</commit_message>
<xml_diff>
--- a/Selling_the_Nation.docx
+++ b/Selling_the_Nation.docx
@@ -802,16 +802,7 @@
           <w:szCs w:val="22"/>
           <w:lang w:val="en-US"/>
         </w:rPr>
-        <w:t>THIS ISSUE ????</w:t>
-      </w:r>
-      <w:r>
-        <w:rPr>
-          <w:rFonts w:ascii="Times New Roman" w:hAnsi="Times New Roman" w:cs="Times New Roman"/>
-          <w:sz w:val="22"/>
-          <w:szCs w:val="22"/>
-          <w:lang w:val="en-US"/>
-        </w:rPr>
-        <w:t>.</w:t>
+        <w:t>Vol. ahead-of-print No. ahead-of-print, doi: 10.1108/cpoib-03-2026-0059</w:t>
       </w:r>
       <w:r>
         <w:rPr>
@@ -1075,7 +1066,7 @@
           <w:szCs w:val="22"/>
           <w:lang w:val="en-US"/>
         </w:rPr>
-        <w:t>THIS ISSUE????</w:t>
+        <w:t>Vol. ahead-of-print No. ahead-of-print, doi: 10.1108/cpoib-03-2026-0056</w:t>
       </w:r>
       <w:r>
         <w:rPr>

</xml_diff>

<commit_message>
Replace Buzdugan (2026) reference with correct book-chapter citation
Per the citation in the Sinkovics PDF, the self-preservation perspective
source is the Buzdugan, Freund, Forsgren and Holm (2026) chapter in
'Reinterpreting Multinational Enterprises...', doi 10.1108/s0733558x20260000101002.

Co-Authored-By: Claude Opus 4.8 <noreply@anthropic.com>
Claude-Session: https://claude.ai/code/session_01467iCMchpirXZm1er2TZxF
</commit_message>
<xml_diff>
--- a/Selling_the_Nation.docx
+++ b/Selling_the_Nation.docx
@@ -831,25 +831,7 @@
           <w:szCs w:val="22"/>
           <w:lang w:val="en-US"/>
         </w:rPr>
-        <w:t xml:space="preserve">Buzdugan, S., Forsgren, M. and Yamin, M. (2026), “Politics, power and the self-preserving MNE: Theoretical reflections on ‘Rules or No Rules: International Business in the Time of Trump’”, Critical Perspectives on International Business, </w:t>
-      </w:r>
-      <w:r>
-        <w:rPr>
-          <w:rFonts w:ascii="Times New Roman" w:hAnsi="Times New Roman" w:cs="Times New Roman"/>
-          <w:sz w:val="22"/>
-          <w:szCs w:val="22"/>
-          <w:lang w:val="en-US"/>
-        </w:rPr>
-        <w:t>THIS ISSUE ????</w:t>
-      </w:r>
-      <w:r>
-        <w:rPr>
-          <w:rFonts w:ascii="Times New Roman" w:hAnsi="Times New Roman" w:cs="Times New Roman"/>
-          <w:sz w:val="22"/>
-          <w:szCs w:val="22"/>
-          <w:lang w:val="en-US"/>
-        </w:rPr>
-        <w:t>.</w:t>
+        <w:t xml:space="preserve">Buzdugan, S.R., Freund, D., Forsgren, M. and Holm, U. (2026), “The self-preservation perspective of the MNE applied in an emerging transnational social space: a new theoretical lens for analyzing anti-societal firm behavior”, in Geppert, M., Bozkurt, Ö. and Dörrenbächer, C. (Eds), Reinterpreting Multinational Enterprises through a Revitalized Transnational Social Space Perspective, Emerald Publishing Limited, Bingley, UK, Vol. 101, doi: 10.1108/s0733558x20260000101002.</w:t>
       </w:r>
     </w:p>
     <w:p>

</xml_diff>